<commit_message>
Update accepted specification and release notes for menu and storage
</commit_message>
<xml_diff>
--- a/docs/sbox-admin-specification.docx
+++ b/docs/sbox-admin-specification.docx
@@ -32,7 +32,7 @@
     </w:p>
     <w:p>
       <w:r>
-        <w:t>Everything ships inside one s&amp;box library and runs within the game or dedicated server process. No external executables, services, companion apps, database servers or separate runtime installation. The console-first release includes commands, permissions, persistence, audit, moderation, ConVar bindings and chat integration. A visual editor, admin menu and web dashboard are out of scope.</w:t>
+        <w:t>Everything ships inside one s&amp;box library. Production authority runs only on an actual dedicated server; explicit editor-host opt-in supports local testing. The package includes console and slash-chat commands, permissions, persistence, audit, moderation, native bindings and an optional bundled ImGui moderation menu. No external executable, service or separate ImGui installation is required. A developer may explicitly select a custom storage backend, including an existing external database, through trusted host code. No database provider or service is installed by the package. Permission editors, dashboards and unrelated gameplay tools remain out of scope.</w:t>
       </w:r>
     </w:p>
     <w:p>
@@ -3568,7 +3568,7 @@
     </w:p>
     <w:p>
       <w:r>
-        <w:t>One self-contained s&amp;box library with internal modules only. No external executables, services or companion apps. Dedicated servers first. No visual editor or dashboard. Exact permissions with deny and inheritance. Owner-only policy administration in v1. One dispatcher, native bindings, chat hooks and host-local storage. Product and repository names remain undecided.</w:t>
+        <w:t>One self-contained s&amp;box library named Superuser, repository sbox-superuser. Actual dedicated servers with explicit local editor testing. Optional bundled and replaceable ImGui moderation menu. Exact permissions with deny and inheritance. Owner-only policy administration. Shared dispatcher, native bindings, slash chat, audit and host-selected storage. No required external executable or service. No permission editor or web dashboard.</w:t>
       </w:r>
     </w:p>
     <w:p>
@@ -3712,6 +3712,41 @@
     <w:p>
       <w:r>
         <w:t>For each task, retain: ID; status; implementation paths and commit; engine/build/environment; validation commands and observed results; limitations; and next task. Allowed states: Not started, In progress, Blocked, Done. Only one task should be In progress for this sequential workflow. Update affected specification sections when an accepted implementation decision changes the contract.</w:t>
+      </w:r>
+    </w:p>
+    <w:p>
+      <w:r>
+        <w:t>Accepted scope update — optional administration interface and custom storage (2026-10-18)</w:t>
+      </w:r>
+    </w:p>
+    <w:p>
+      <w:r>
+        <w:t>This update supersedes earlier exclusions of an admin menu. Ship the reviewed MIT-licensed C# widgets from zeljkovranjes/sbox-imgui internally in the existing library, with license and provenance. Keep all ImGui types out of the public administration API.</w:t>
+      </w:r>
+    </w:p>
+    <w:p>
+      <w:r>
+        <w:t>Provide searchable online names and Steam IDs; exact-ID selection; roles, visible active punishments and paged history; kick, warn, timed/permanent ban, unban, text mute and unmute. Provide offline Steam ID lookup, reason/duration fields, confirmation of frozen action input, explicit outcomes and permission-filtered recent activity.</w:t>
+      </w:r>
+    </w:p>
+    <w:p>
+      <w:r>
+        <w:t>Authenticate network requests with the actual engine connection. Reuse the existing dispatcher, command permissions, protection checks, storage and audit. Filter every query on the host; deliver results privately. Bound input, concurrent requests and pages. Do not expose arbitrary console execution or accept client-supplied authority.</w:t>
+      </w:r>
+    </w:p>
+    <w:p>
+      <w:r>
+        <w:t>The default menu is a removable client component with a configurable F6 default key, Escape close and owned input/cursor lifetime. Disabling it preserves console, slash chat and UI-independent query/action/result APIs. Report timeouts or disconnected requests as Unknown; do not retry mutations automatically.</w:t>
+      </w:r>
+    </w:p>
+    <w:p>
+      <w:r>
+        <w:t>Provide a host-only scene-scoped storage factory before bootstrap enablement. The backend contract includes versioned atomic writes, explicit missing/corrupt/unavailable outcomes, backup recovery and audit retention. Preserve previous generations and audit intents. Provider failure must not select an empty fallback. Editor and dedicated data remain separate; one authoritative host owns each storage namespace.</w:t>
+      </w:r>
+    </w:p>
+    <w:p>
+      <w:r>
+        <w:t>Verify generated-project compilation, engine whitelist, actual rendering, authorized and denied requests, private delivery and disable/replacement behavior. Compile all tutorial examples. Document external provider-specific behavior as unverified until tested against an actual endpoint. See repository docs/admin-menu.md and docs/storage-tutorial.md for integration.</w:t>
       </w:r>
     </w:p>
     <w:sectPr>

</xml_diff>